<commit_message>
fix: TUBITAK Sonuc Raporu sablon uyumu duzeltildi
7 kritik duzeltme:
1. Tablo alan adi: PROJE YURUTUCUSU -> PROJE YURUTUCUSUNUN ADI
2. Tablo alan adi: DANISMAN -> DANISMANIN ADI
3. Tablo alan adi: PROJE TARIHLERI -> PROJE BASLANGIC VE BITIS TARIHLERI
4. Font: 9pt -> 12pt (sablon standardi)
5. Sol margin: 3cm -> 2.5cm (sablon standardi)
6. GENEL BILGILER basligi eklendi
7. Imza tablosu sablon formatina cevrildi (ADI-SOYADI-IMZA)
</commit_message>
<xml_diff>
--- a/Docs/TUBITAK_2209A_Sonuc_Raporu.docx
+++ b/Docs/TUBITAK_2209A_Sonuc_Raporu.docx
@@ -4,34 +4,61 @@
   <w:body>
     <w:p>
       <w:pPr>
-        <w:pStyle w:val="Title"/>
+        <w:jc w:val="center"/>
       </w:pPr>
       <w:r>
-        <w:t>TÜBİTAK 2209-A SONUÇ RAPORU</w:t>
+        <w:rPr>
+          <w:b/>
+          <w:sz w:val="28"/>
+        </w:rPr>
+        <w:t>TÜBİTAK 2209-A ÜNİVERSİTE ÖĞRENCİLERİ ARAŞTIRMA PROJELERİ</w:t>
+        <w:br/>
+        <w:t>DESTEKLEME PROGRAMI</w:t>
       </w:r>
     </w:p>
     <w:p/>
+    <w:p>
+      <w:pPr>
+        <w:jc w:val="center"/>
+      </w:pPr>
+      <w:r>
+        <w:rPr>
+          <w:b/>
+          <w:sz w:val="28"/>
+        </w:rPr>
+        <w:t>SONUÇ RAPORU</w:t>
+      </w:r>
+    </w:p>
+    <w:p/>
+    <w:p>
+      <w:pPr>
+        <w:pStyle w:val="Heading1"/>
+      </w:pPr>
+      <w:r>
+        <w:t>GENEL BİLGİLER</w:t>
+      </w:r>
+    </w:p>
     <w:tbl>
       <w:tblPr>
-        <w:tblStyle w:val="LightShading-Accent1"/>
+        <w:tblStyle w:val="TableGrid"/>
         <w:tblW w:type="auto" w:w="0"/>
         <w:jc w:val="center"/>
         <w:tblLook w:firstColumn="1" w:firstRow="1" w:lastColumn="0" w:lastRow="0" w:noHBand="0" w:noVBand="1" w:val="04A0"/>
       </w:tblPr>
       <w:tblGrid>
-        <w:gridCol w:w="4561"/>
-        <w:gridCol w:w="4561"/>
+        <w:gridCol w:w="4703"/>
+        <w:gridCol w:w="4703"/>
       </w:tblGrid>
       <w:tr>
         <w:tc>
           <w:tcPr>
-            <w:tcW w:type="dxa" w:w="4561"/>
+            <w:tcW w:type="dxa" w:w="4703"/>
           </w:tcPr>
           <w:p>
             <w:r>
               <w:rPr>
                 <w:b/>
-                <w:sz w:val="18"/>
+                <w:sz w:val="22"/>
               </w:rPr>
               <w:t>PROJENİN KONUSU</w:t>
             </w:r>
@@ -39,12 +66,12 @@
         </w:tc>
         <w:tc>
           <w:tcPr>
-            <w:tcW w:type="dxa" w:w="4561"/>
+            <w:tcW w:type="dxa" w:w="4703"/>
           </w:tcPr>
           <w:p>
             <w:r>
               <w:rPr>
-                <w:sz w:val="18"/>
+                <w:sz w:val="22"/>
               </w:rPr>
               <w:t>MC-AWARE: Derin Öğrenmede Anti-Prediktif Davranışın Çok Boyutlu Teşhisi</w:t>
             </w:r>
@@ -54,28 +81,28 @@
       <w:tr>
         <w:tc>
           <w:tcPr>
-            <w:tcW w:type="dxa" w:w="4561"/>
+            <w:tcW w:type="dxa" w:w="4703"/>
           </w:tcPr>
           <w:p>
             <w:r>
               <w:rPr>
                 <w:b/>
-                <w:sz w:val="18"/>
+                <w:sz w:val="22"/>
               </w:rPr>
-              <w:t>PROJE YÜRÜTÜCÜSÜ</w:t>
+              <w:t>PROJE YÜRÜTÜCÜSÜNÜN ADI</w:t>
             </w:r>
           </w:p>
         </w:tc>
         <w:tc>
           <w:tcPr>
-            <w:tcW w:type="dxa" w:w="4561"/>
+            <w:tcW w:type="dxa" w:w="4703"/>
           </w:tcPr>
           <w:p>
             <w:r>
               <w:rPr>
-                <w:sz w:val="18"/>
+                <w:sz w:val="22"/>
               </w:rPr>
-              <w:t>Mehmet Ali Kurt — Hacettepe Üniversitesi, Aktüerya Bilimleri</w:t>
+              <w:t>Mehmet Ali Kurt</w:t>
             </w:r>
           </w:p>
         </w:tc>
@@ -83,26 +110,26 @@
       <w:tr>
         <w:tc>
           <w:tcPr>
-            <w:tcW w:type="dxa" w:w="4561"/>
+            <w:tcW w:type="dxa" w:w="4703"/>
           </w:tcPr>
           <w:p>
             <w:r>
               <w:rPr>
                 <w:b/>
-                <w:sz w:val="18"/>
+                <w:sz w:val="22"/>
               </w:rPr>
-              <w:t>DANIŞMAN</w:t>
+              <w:t>DANIŞMANIN ADI</w:t>
             </w:r>
           </w:p>
         </w:tc>
         <w:tc>
           <w:tcPr>
-            <w:tcW w:type="dxa" w:w="4561"/>
+            <w:tcW w:type="dxa" w:w="4703"/>
           </w:tcPr>
           <w:p>
             <w:r>
               <w:rPr>
-                <w:sz w:val="18"/>
+                <w:sz w:val="22"/>
               </w:rPr>
               <w:t>Öğr. Gör. Elif Ayaz</w:t>
             </w:r>
@@ -112,26 +139,26 @@
       <w:tr>
         <w:tc>
           <w:tcPr>
-            <w:tcW w:type="dxa" w:w="4561"/>
+            <w:tcW w:type="dxa" w:w="4703"/>
           </w:tcPr>
           <w:p>
             <w:r>
               <w:rPr>
                 <w:b/>
-                <w:sz w:val="18"/>
+                <w:sz w:val="22"/>
               </w:rPr>
-              <w:t>PROJE TARİHLERİ</w:t>
+              <w:t>PROJE BAŞLANGIÇ VE BİTİŞ TARİHLERİ</w:t>
             </w:r>
           </w:p>
         </w:tc>
         <w:tc>
           <w:tcPr>
-            <w:tcW w:type="dxa" w:w="4561"/>
+            <w:tcW w:type="dxa" w:w="4703"/>
           </w:tcPr>
           <w:p>
             <w:r>
               <w:rPr>
-                <w:sz w:val="18"/>
+                <w:sz w:val="22"/>
               </w:rPr>
               <w:t>Başlangıç: Ekim 2025 — Bitiş: Haziran 2026</w:t>
             </w:r>
@@ -142,15 +169,28 @@
     <w:p/>
     <w:p>
       <w:pPr>
+        <w:jc w:val="center"/>
+      </w:pPr>
+      <w:r>
+        <w:rPr>
+          <w:b/>
+          <w:sz w:val="24"/>
+        </w:rPr>
+        <w:t>Sonuç Raporu Formatı:</w:t>
+      </w:r>
+    </w:p>
+    <w:p/>
+    <w:p>
+      <w:pPr>
         <w:pStyle w:val="Heading1"/>
       </w:pPr>
       <w:r>
-        <w:t>1. GİRİŞ</w:t>
+        <w:t>Giriş</w:t>
       </w:r>
     </w:p>
     <w:p>
       <w:pPr>
-        <w:ind w:firstLine="425"/>
+        <w:ind w:firstLine="567"/>
       </w:pPr>
       <w:r>
         <w:t>Bu proje, TÜBİTAK 2209-A Lisans Araştırma Projeleri Destekleme Programı kapsamında, Borsa İstanbul (BIST) günlük yön tahmininde derin öğrenme modellerinin beklenmedik bir davranışını — anti-prediktif eğilimi — sistematik olarak tespit etmeyi ve çok boyutlu teşhisini gerçekleştirmeyi amaçlamaktadır.</w:t>
@@ -158,15 +198,15 @@
     </w:p>
     <w:p>
       <w:pPr>
-        <w:ind w:firstLine="425"/>
+        <w:ind w:firstLine="567"/>
       </w:pPr>
       <w:r>
-        <w:t>Anti-prediktif davranış, bir makine öğrenmesi modelinin rastgele tahminden (~%50) sistematik olarak daha kötü performans sergilemesi, yani tahminlerinin gerçek sonuçlarla negatif korelasyon göstermesi durumudur. Bu fenomen, modelin güçlü bir sinyal yakaladığını ancak bu sinyalin yönünün test döneminde tersine döndüğünü gösterir. Projemiz, bu fenomeni salt tespit etmekle kalmayıp, hangi koşullarda tetiklendiğini (sektör, pencere uzunluğu, makro değişken, dönem) sistematik olarak haritalamıştır.</w:t>
+        <w:t>Anti-prediktif davranış, bir makine öğrenmesi modelinin rastgele tahminden (~%50) sistematik olarak daha kötü performans sergilemesi, yani tahminlerinin gerçek sonuçlarla negatif korelasyon göstermesi durumudur. Bu fenomen, modelin güçlü bir sinyal yakaladığını ancak bu sinyalin yönünün test döneminde tersine döndüğünü gösterir.</w:t>
       </w:r>
     </w:p>
     <w:p>
       <w:pPr>
-        <w:ind w:firstLine="425"/>
+        <w:ind w:firstLine="567"/>
       </w:pPr>
       <w:r>
         <w:t>Projede 6 farklı derin öğrenme mimarisi (BiLSTM, GRU, Conv1D, TCN, Transformer, SimpleRNN) ile 700'den fazla konfigürasyon, 11 BIST hissesi, 27 varlık ve 130 CSV çıktı üretilmiştir. Türk akademik literatüründe, derin öğrenme modellerinin Çoğunluk Sınıfı (MC) tuzağını sistematik olarak belgeleyen ve anti-prediktif davranışı çok boyutlu teşhis eden ilk çalışmadır.</w:t>
@@ -177,15 +217,16 @@
         <w:pStyle w:val="Heading1"/>
       </w:pPr>
       <w:r>
-        <w:t>2. RAPOR DÖNEMLERİNDE YAPILAN ÇALIŞMALAR</w:t>
+        <w:t>Rapor Dönemlerinde Yapılan Çalışmalar</w:t>
       </w:r>
     </w:p>
     <w:p>
-      <w:pPr>
-        <w:pStyle w:val="Heading2"/>
-      </w:pPr>
       <w:r>
-        <w:t>2.1. Faz 1: Prototipleme ve İlk Deneyler (Ekim–Aralık 2025)</w:t>
+        <w:rPr>
+          <w:b/>
+          <w:sz w:val="24"/>
+        </w:rPr>
+        <w:t>Faz 1: Prototipleme ve İlk Deneyler (Ekim–Aralık 2025)</w:t>
       </w:r>
     </w:p>
     <w:p>
@@ -193,7 +234,7 @@
         <w:pStyle w:val="ListBullet"/>
       </w:pPr>
       <w:r>
-        <w:t>BiLSTM v1-v3 prototiplerinin geliştirilmesi ve THYAO hissesi üzerinde test edilmesi</w:t>
+        <w:t>BiLSTM v1-v3 prototiplerinin geliştirilmesi ve THYAO hissesi üzerinde test edilmesi.</w:t>
       </w:r>
     </w:p>
     <w:p>
@@ -201,7 +242,7 @@
         <w:pStyle w:val="ListBullet"/>
       </w:pPr>
       <w:r>
-        <w:t>Makroekonomik değişkenlerin (USDTRY, Brent Petrol, TCMB Faiz) entegrasyonu</w:t>
+        <w:t>Makroekonomik değişkenlerin (USDTRY, Brent Petrol, TCMB Faiz) modele entegrasyonu.</w:t>
       </w:r>
     </w:p>
     <w:p>
@@ -209,7 +250,7 @@
         <w:pStyle w:val="ListBullet"/>
       </w:pPr>
       <w:r>
-        <w:t>MC tuzağının tespit edilmesi ve class_weight=balanced ile çözülmesi</w:t>
+        <w:t>Çoğunluk Sınıfı (MC) tuzağının tespit edilmesi ve class_weight=balanced yöntemiyle çözülmesi.</w:t>
       </w:r>
     </w:p>
     <w:p>
@@ -217,7 +258,7 @@
         <w:pStyle w:val="ListBullet"/>
       </w:pPr>
       <w:r>
-        <w:t>Anti-prediktif davranışın ilk kez gözlemlenmesi (~%40 model doğruluğu, ~%60 flip doğruluğu)</w:t>
+        <w:t>Anti-prediktif davranışın ilk kez gözlemlenmesi: model ~%40 doğruluk, flip ~%60 doğruluk.</w:t>
       </w:r>
     </w:p>
     <w:p>
@@ -225,15 +266,17 @@
         <w:pStyle w:val="ListBullet"/>
       </w:pPr>
       <w:r>
-        <w:t>İlk CSV çıktılarının üretilmesi ve analiz pipeline oluşturulması</w:t>
+        <w:t>İlk CSV çıktılarının üretilmesi ve analiz pipeline oluşturulması.</w:t>
       </w:r>
     </w:p>
+    <w:p/>
     <w:p>
-      <w:pPr>
-        <w:pStyle w:val="Heading2"/>
-      </w:pPr>
       <w:r>
-        <w:t>2.2. Faz 2: Ablasyon ve Diagnostik Deneyler (Ocak–Şubat 2026)</w:t>
+        <w:rPr>
+          <w:b/>
+          <w:sz w:val="24"/>
+        </w:rPr>
+        <w:t>Faz 2: Ablasyon ve Diagnostik Deneyler (Ocak–Şubat 2026)</w:t>
       </w:r>
     </w:p>
     <w:p>
@@ -241,7 +284,7 @@
         <w:pStyle w:val="ListBullet"/>
       </w:pPr>
       <w:r>
-        <w:t>Özellik Grubu Ablasyonu: full_13 vs no_ext_10 — makro değişkenler çıkarılınca anti-prediktif davranış yok oldu</w:t>
+        <w:t>Özellik Grubu Ablasyonu: full_13 vs no_ext_10 karşılaştırması. Makro değişkenler çıkarıldığında anti-prediktif davranış tamamen ortadan kalkmıştır.</w:t>
       </w:r>
     </w:p>
     <w:p>
@@ -249,7 +292,7 @@
         <w:pStyle w:val="ListBullet"/>
       </w:pPr>
       <w:r>
-        <w:t>Tekli Özellik Ablasyonu: Tek değişken çıkarıldığında etki yok → sinerjik sahte korelasyon kesin</w:t>
+        <w:t>Tekli Özellik Ablasyonu: Tek değişken çıkarıldığında etki gözlemlenmemiş, dış değişkenlerin sinerjik sahte korelasyon oluşturduğu kesinleşmiştir.</w:t>
       </w:r>
     </w:p>
     <w:p>
@@ -257,7 +300,7 @@
         <w:pStyle w:val="ListBullet"/>
       </w:pPr>
       <w:r>
-        <w:t>IN_LEN Ablasyonu v1 ve v2: IN_LEN ≤ 5 anti-prediktif tetikler, IN_LEN = 10 ortadan kaldırır</w:t>
+        <w:t>IN_LEN Ablasyonu v1 ve v2: IN_LEN ≤ 5 anti-prediktif davranışı tetiklerken, IN_LEN = 10 tamamen ortadan kaldırmıştır.</w:t>
       </w:r>
     </w:p>
     <w:p>
@@ -265,7 +308,7 @@
         <w:pStyle w:val="ListBullet"/>
       </w:pPr>
       <w:r>
-        <w:t>MI Kalibrasyon: Karşılıklı Bilgi skorlarının histogram yanlılığı tespiti</w:t>
+        <w:t>MI Kalibrasyon: Karşılıklı Bilgi (MI) skorlarının histogram yanlılığı içerdiği saptanmıştır.</w:t>
       </w:r>
     </w:p>
     <w:p>
@@ -273,15 +316,17 @@
         <w:pStyle w:val="ListBullet"/>
       </w:pPr>
       <w:r>
-        <w:t>Label Check: Etiket doğrulama ve veri bütünlüğü kontrolü</w:t>
+        <w:t>Etiket doğrulama ve veri bütünlüğü kontrolü gerçekleştirilmiştir.</w:t>
       </w:r>
     </w:p>
+    <w:p/>
     <w:p>
-      <w:pPr>
-        <w:pStyle w:val="Heading2"/>
-      </w:pPr>
       <w:r>
-        <w:t>2.3. Faz 3: Çoklu Mimari Testi ve Walk-Forward (Mart–Nisan 2026)</w:t>
+        <w:rPr>
+          <w:b/>
+          <w:sz w:val="24"/>
+        </w:rPr>
+        <w:t>Faz 3: Çoklu Mimari Testi ve Walk-Forward Doğrulama (Mart–Nisan 2026)</w:t>
       </w:r>
     </w:p>
     <w:p>
@@ -289,7 +334,7 @@
         <w:pStyle w:val="ListBullet"/>
       </w:pPr>
       <w:r>
-        <w:t>6 DL mimarisinin (BiLSTM, GRU, Conv1D, TCN, Transformer, SimpleRNN) sistematik karşılaştırması</w:t>
+        <w:t>6 farklı derin öğrenme mimarisinin (BiLSTM, GRU, Conv1D, TCN, Transformer, SimpleRNN) sistematik karşılaştırması yapılmıştır.</w:t>
       </w:r>
     </w:p>
     <w:p>
@@ -297,7 +342,7 @@
         <w:pStyle w:val="ListBullet"/>
       </w:pPr>
       <w:r>
-        <w:t>McNemar testi ile mimariler arası istatistiksel fark analizi</w:t>
+        <w:t>McNemar testi ile mimariler arası istatistiksel fark analizi gerçekleştirilmiştir.</w:t>
       </w:r>
     </w:p>
     <w:p>
@@ -305,7 +350,7 @@
         <w:pStyle w:val="ListBullet"/>
       </w:pPr>
       <w:r>
-        <w:t>7-fold Walk-Forward v1 ve v2 doğrulama — val_data düzeltmesi</w:t>
+        <w:t>7-fold Walk-Forward v1 ve v2 doğrulama uygulanmış, v2 ile validasyon verisi (val_data) düzeltmesi yapılmıştır.</w:t>
       </w:r>
     </w:p>
     <w:p>
@@ -313,7 +358,7 @@
         <w:pStyle w:val="ListBullet"/>
       </w:pPr>
       <w:r>
-        <w:t>Dönemsel anti-prediktif harita: Fold 2-3 (COVID) = %100, Fold 1,4,5 = %0</w:t>
+        <w:t>Dönemsel anti-prediktif harita çıkarılmıştır: Fold 2-3 (COVID-19 dönemi) = %100 anti-prediktif, Fold 1, 4, 5 (normal dönemler) = %0.</w:t>
       </w:r>
     </w:p>
     <w:p>
@@ -321,15 +366,17 @@
         <w:pStyle w:val="ListBullet"/>
       </w:pPr>
       <w:r>
-        <w:t>Ensemble deneyleri: Hard Vote ve Soft Vote — anti-prediktif davranış korundu</w:t>
+        <w:t>Ensemble deneyleri (Hard Vote, Soft Vote) gerçekleştirilmiş, anti-prediktif davranışın ensemble seviyesinde de korunduğu gösterilmiştir.</w:t>
       </w:r>
     </w:p>
+    <w:p/>
     <w:p>
-      <w:pPr>
-        <w:pStyle w:val="Heading2"/>
-      </w:pPr>
       <w:r>
-        <w:t>2.4. Faz 4: Çapraz Piyasa ve Çoklu Hisse Testleri (Nisan–Mayıs 2026)</w:t>
+        <w:rPr>
+          <w:b/>
+          <w:sz w:val="24"/>
+        </w:rPr>
+        <w:t>Faz 4: Çapraz Piyasa ve Çoklu Hisse Testleri (Nisan–Mayıs 2026)</w:t>
       </w:r>
     </w:p>
     <w:p>
@@ -337,7 +384,7 @@
         <w:pStyle w:val="ListBullet"/>
       </w:pPr>
       <w:r>
-        <w:t>NASDAQ (AAPL) vs BIST (THYAO) çapraz piyasa testi: BIST anti-prediktif, NASDAQ normal</w:t>
+        <w:t>NASDAQ (AAPL) vs BIST (THYAO) çapraz piyasa testi: BIST anti-prediktif davranış sergilerken, NASDAQ normal davranış göstermiştir.</w:t>
       </w:r>
     </w:p>
     <w:p>
@@ -345,7 +392,7 @@
         <w:pStyle w:val="ListBullet"/>
       </w:pPr>
       <w:r>
-        <w:t>11 BIST hissesinde genişletilmiş test: 5 anti-prediktif, 6 normal/nötr</w:t>
+        <w:t>11 BIST hissesinde genişletilmiş test: 5 hisse anti-prediktif (THYAO, PGSUS, HEKTS, SASA, KRDMD), 6 hisse normal/nötr davranış.</w:t>
       </w:r>
     </w:p>
     <w:p>
@@ -353,7 +400,7 @@
         <w:pStyle w:val="ListBullet"/>
       </w:pPr>
       <w:r>
-        <w:t>Sektörel ayrışma kesin olarak kanıtlandı: havacılık + spekülatif → anti-prediktif, bankacılık → normal</w:t>
+        <w:t>Sektörel ayrışma kesin olarak kanıtlanmıştır: havacılık ve spekülatif sektörler anti-prediktif, bankacılık ve otomotiv sektörleri normal.</w:t>
       </w:r>
     </w:p>
     <w:p>
@@ -361,7 +408,7 @@
         <w:pStyle w:val="ListBullet"/>
       </w:pPr>
       <w:r>
-        <w:t>Bonferroni-düzeltilmiş p = 0.00012 ile istatistiksel anlamlılık</w:t>
+        <w:t>Bonferroni-düzeltilmiş p = 0.00012 ile istatistiksel anlamlılık doğrulanmıştır.</w:t>
       </w:r>
     </w:p>
     <w:p>
@@ -369,15 +416,17 @@
         <w:pStyle w:val="ListBullet"/>
       </w:pPr>
       <w:r>
-        <w:t>Sigorta ve holding sektörlü testler (BES fonları dahil)</w:t>
+        <w:t>BES fonları dahil sigorta ve holding sektörlü testler gerçekleştirilmiştir.</w:t>
       </w:r>
     </w:p>
+    <w:p/>
     <w:p>
-      <w:pPr>
-        <w:pStyle w:val="Heading2"/>
-      </w:pPr>
       <w:r>
-        <w:t>2.5. Faz 5: Dokümantasyon ve Yayın Hazırlığı (Mayıs–Haziran 2026)</w:t>
+        <w:rPr>
+          <w:b/>
+          <w:sz w:val="24"/>
+        </w:rPr>
+        <w:t>Faz 5: Dokümantasyon ve Yayın Hazırlığı (Mayıs–Haziran 2026)</w:t>
       </w:r>
     </w:p>
     <w:p>
@@ -385,7 +434,7 @@
         <w:pStyle w:val="ListBullet"/>
       </w:pPr>
       <w:r>
-        <w:t>Literatür taraması: 25 bölüm, 30+ referans (Türk çalışmaları, uluslararası makaleler)</w:t>
+        <w:t>Kapsamlı literatür taraması: 25 bölüm, 30+ referans (Türk çalışmaları dahil).</w:t>
       </w:r>
     </w:p>
     <w:p>
@@ -393,7 +442,7 @@
         <w:pStyle w:val="ListBullet"/>
       </w:pPr>
       <w:r>
-        <w:t>Limitasyonlar: 15 kısıt ve 15 gelecek çalışma iş paketi</w:t>
+        <w:t>Araştırmanın kısıtları: 15 kısıt ve 15 gelecek çalışma iş paketi belirlenmiştir.</w:t>
       </w:r>
     </w:p>
     <w:p>
@@ -401,7 +450,7 @@
         <w:pStyle w:val="ListBullet"/>
       </w:pPr>
       <w:r>
-        <w:t>Streamlit dashboard (10 tab, TR/EN dil desteği): app.py</w:t>
+        <w:t>Streamlit interaktif dashboard geliştirilmiştir (10 tab, TR/EN dil desteği).</w:t>
       </w:r>
     </w:p>
     <w:p>
@@ -409,7 +458,7 @@
         <w:pStyle w:val="ListBullet"/>
       </w:pPr>
       <w:r>
-        <w:t>GitHub Pages statik dashboard: Docs/Dashboard/</w:t>
+        <w:t>GitHub Pages statik dashboard oluşturulmuştur.</w:t>
       </w:r>
     </w:p>
     <w:p>
@@ -417,7 +466,7 @@
         <w:pStyle w:val="ListBullet"/>
       </w:pPr>
       <w:r>
-        <w:t>37 rapor görseli, 4 özel rapor görseli (G1-G4)</w:t>
+        <w:t>37 rapor görseli ve 4 özel rapor görseli (G1-G4) hazırlanmıştır.</w:t>
       </w:r>
     </w:p>
     <w:p>
@@ -425,7 +474,7 @@
         <w:pStyle w:val="ListBullet"/>
       </w:pPr>
       <w:r>
-        <w:t>Profesyonel dosya yapısı düzenleme ve GitHub push (248 dosya)</w:t>
+        <w:t>Profesyonel dosya yapısı düzenlemesi ve GitHub deposuna aktarım (248 dosya) tamamlanmıştır.</w:t>
       </w:r>
     </w:p>
     <w:p>
@@ -433,12 +482,12 @@
         <w:pStyle w:val="Heading1"/>
       </w:pPr>
       <w:r>
-        <w:t>3. SONUÇ</w:t>
+        <w:t>Sonuç</w:t>
       </w:r>
     </w:p>
     <w:p>
       <w:pPr>
-        <w:ind w:firstLine="425"/>
+        <w:ind w:firstLine="567"/>
       </w:pPr>
       <w:r>
         <w:t>Proje kapsamında gerçekleştirilen kapsamlı deneysel çalışma, derin öğrenme modellerinin gelişmekte olan piyasalarda (BIST) sistematik olarak anti-prediktif davranış sergileyebildiğini kesin olarak kanıtlamıştır. Aşağıdaki tablo, projenin temel özgün katkılarını özetlemektedir:</w:t>
@@ -447,25 +496,25 @@
     <w:p/>
     <w:tbl>
       <w:tblPr>
-        <w:tblStyle w:val="LightShading-Accent1"/>
+        <w:tblStyle w:val="TableGrid"/>
         <w:tblW w:type="auto" w:w="0"/>
         <w:jc w:val="center"/>
         <w:tblLook w:firstColumn="1" w:firstRow="1" w:lastColumn="0" w:lastRow="0" w:noHBand="0" w:noVBand="1" w:val="04A0"/>
       </w:tblPr>
       <w:tblGrid>
-        <w:gridCol w:w="4561"/>
-        <w:gridCol w:w="4561"/>
+        <w:gridCol w:w="4703"/>
+        <w:gridCol w:w="4703"/>
       </w:tblGrid>
       <w:tr>
         <w:tc>
           <w:tcPr>
-            <w:tcW w:type="dxa" w:w="4561"/>
+            <w:tcW w:type="dxa" w:w="4703"/>
           </w:tcPr>
           <w:p>
             <w:r>
               <w:rPr>
                 <w:b/>
-                <w:sz w:val="16"/>
+                <w:sz w:val="20"/>
               </w:rPr>
               <w:t>Bulgu</w:t>
             </w:r>
@@ -473,13 +522,13 @@
         </w:tc>
         <w:tc>
           <w:tcPr>
-            <w:tcW w:type="dxa" w:w="4561"/>
+            <w:tcW w:type="dxa" w:w="4703"/>
           </w:tcPr>
           <w:p>
             <w:r>
               <w:rPr>
                 <w:b/>
-                <w:sz w:val="16"/>
+                <w:sz w:val="20"/>
               </w:rPr>
               <w:t>Kanıt</w:t>
             </w:r>
@@ -489,12 +538,12 @@
       <w:tr>
         <w:tc>
           <w:tcPr>
-            <w:tcW w:type="dxa" w:w="4561"/>
+            <w:tcW w:type="dxa" w:w="4703"/>
           </w:tcPr>
           <w:p>
             <w:r>
               <w:rPr>
-                <w:sz w:val="16"/>
+                <w:sz w:val="20"/>
               </w:rPr>
               <w:t>Anti-prediktif davranış</w:t>
             </w:r>
@@ -502,14 +551,14 @@
         </w:tc>
         <w:tc>
           <w:tcPr>
-            <w:tcW w:type="dxa" w:w="4561"/>
+            <w:tcW w:type="dxa" w:w="4703"/>
           </w:tcPr>
           <w:p>
             <w:r>
               <w:rPr>
-                <w:sz w:val="16"/>
+                <w:sz w:val="20"/>
               </w:rPr>
-              <w:t>700+ konfig., 6 mimari, ~%40 model → ~%60 flip</w:t>
+              <w:t>700+ konfigürasyon, 6 mimari, ~%40 model → ~%60 flip</w:t>
             </w:r>
           </w:p>
         </w:tc>
@@ -517,12 +566,12 @@
       <w:tr>
         <w:tc>
           <w:tcPr>
-            <w:tcW w:type="dxa" w:w="4561"/>
+            <w:tcW w:type="dxa" w:w="4703"/>
           </w:tcPr>
           <w:p>
             <w:r>
               <w:rPr>
-                <w:sz w:val="16"/>
+                <w:sz w:val="20"/>
               </w:rPr>
               <w:t>Sektörel ayrışma</w:t>
             </w:r>
@@ -530,14 +579,14 @@
         </w:tc>
         <w:tc>
           <w:tcPr>
-            <w:tcW w:type="dxa" w:w="4561"/>
+            <w:tcW w:type="dxa" w:w="4703"/>
           </w:tcPr>
           <w:p>
             <w:r>
               <w:rPr>
-                <w:sz w:val="16"/>
+                <w:sz w:val="20"/>
               </w:rPr>
-              <w:t>Havacılık/spekülatif: %100, bankacılık: normal</w:t>
+              <w:t>Havacılık/spekülatif: %100, bankacılık: normal (p &lt; 0.0001)</w:t>
             </w:r>
           </w:p>
         </w:tc>
@@ -545,12 +594,12 @@
       <w:tr>
         <w:tc>
           <w:tcPr>
-            <w:tcW w:type="dxa" w:w="4561"/>
+            <w:tcW w:type="dxa" w:w="4703"/>
           </w:tcPr>
           <w:p>
             <w:r>
               <w:rPr>
-                <w:sz w:val="16"/>
+                <w:sz w:val="20"/>
               </w:rPr>
               <w:t>Pencere uzunluğu etkisi</w:t>
             </w:r>
@@ -558,14 +607,14 @@
         </w:tc>
         <w:tc>
           <w:tcPr>
-            <w:tcW w:type="dxa" w:w="4561"/>
+            <w:tcW w:type="dxa" w:w="4703"/>
           </w:tcPr>
           <w:p>
             <w:r>
               <w:rPr>
-                <w:sz w:val="16"/>
+                <w:sz w:val="20"/>
               </w:rPr>
-              <w:t>IN_LEN≤5: tetikler, IN_LEN=10: ortadan kaldırır</w:t>
+              <w:t>IN_LEN ≤ 5: tetikler, IN_LEN = 10: ortadan kaldırır</w:t>
             </w:r>
           </w:p>
         </w:tc>
@@ -573,12 +622,12 @@
       <w:tr>
         <w:tc>
           <w:tcPr>
-            <w:tcW w:type="dxa" w:w="4561"/>
+            <w:tcW w:type="dxa" w:w="4703"/>
           </w:tcPr>
           <w:p>
             <w:r>
               <w:rPr>
-                <w:sz w:val="16"/>
+                <w:sz w:val="20"/>
               </w:rPr>
               <w:t>Makro değişken mekanizması</w:t>
             </w:r>
@@ -586,14 +635,14 @@
         </w:tc>
         <w:tc>
           <w:tcPr>
-            <w:tcW w:type="dxa" w:w="4561"/>
+            <w:tcW w:type="dxa" w:w="4703"/>
           </w:tcPr>
           <w:p>
             <w:r>
               <w:rPr>
-                <w:sz w:val="16"/>
+                <w:sz w:val="20"/>
               </w:rPr>
-              <w:t>USDTRY+Oil+TCMB çıkarılınca anomali yok</w:t>
+              <w:t>USDTRY + Oil + TCMB çıkarılınca anomali tamamen yok</w:t>
             </w:r>
           </w:p>
         </w:tc>
@@ -601,12 +650,12 @@
       <w:tr>
         <w:tc>
           <w:tcPr>
-            <w:tcW w:type="dxa" w:w="4561"/>
+            <w:tcW w:type="dxa" w:w="4703"/>
           </w:tcPr>
           <w:p>
             <w:r>
               <w:rPr>
-                <w:sz w:val="16"/>
+                <w:sz w:val="20"/>
               </w:rPr>
               <w:t>Dönemsel harita</w:t>
             </w:r>
@@ -614,12 +663,12 @@
         </w:tc>
         <w:tc>
           <w:tcPr>
-            <w:tcW w:type="dxa" w:w="4561"/>
+            <w:tcW w:type="dxa" w:w="4703"/>
           </w:tcPr>
           <w:p>
             <w:r>
               <w:rPr>
-                <w:sz w:val="16"/>
+                <w:sz w:val="20"/>
               </w:rPr>
               <w:t>COVID (Fold 2-3): %100, Normal (Fold 1,4,5): %0</w:t>
             </w:r>
@@ -629,12 +678,12 @@
       <w:tr>
         <w:tc>
           <w:tcPr>
-            <w:tcW w:type="dxa" w:w="4561"/>
+            <w:tcW w:type="dxa" w:w="4703"/>
           </w:tcPr>
           <w:p>
             <w:r>
               <w:rPr>
-                <w:sz w:val="16"/>
+                <w:sz w:val="20"/>
               </w:rPr>
               <w:t>Çapraz piyasa</w:t>
             </w:r>
@@ -642,12 +691,12 @@
         </w:tc>
         <w:tc>
           <w:tcPr>
-            <w:tcW w:type="dxa" w:w="4561"/>
+            <w:tcW w:type="dxa" w:w="4703"/>
           </w:tcPr>
           <w:p>
             <w:r>
               <w:rPr>
-                <w:sz w:val="16"/>
+                <w:sz w:val="20"/>
               </w:rPr>
               <w:t>BIST anti-prediktif, NASDAQ normal</w:t>
             </w:r>
@@ -657,12 +706,12 @@
       <w:tr>
         <w:tc>
           <w:tcPr>
-            <w:tcW w:type="dxa" w:w="4561"/>
+            <w:tcW w:type="dxa" w:w="4703"/>
           </w:tcPr>
           <w:p>
             <w:r>
               <w:rPr>
-                <w:sz w:val="16"/>
+                <w:sz w:val="20"/>
               </w:rPr>
               <w:t>MC tuzağı çözümü</w:t>
             </w:r>
@@ -670,14 +719,14 @@
         </w:tc>
         <w:tc>
           <w:tcPr>
-            <w:tcW w:type="dxa" w:w="4561"/>
+            <w:tcW w:type="dxa" w:w="4703"/>
           </w:tcPr>
           <w:p>
             <w:r>
               <w:rPr>
-                <w:sz w:val="16"/>
+                <w:sz w:val="20"/>
               </w:rPr>
-              <w:t>700+ koşuda MC = 0</w:t>
+              <w:t>700+ koşuda MC = 0 (hiçbir model çoğunluk sınıfına çökmedi)</w:t>
             </w:r>
           </w:p>
         </w:tc>
@@ -685,12 +734,12 @@
       <w:tr>
         <w:tc>
           <w:tcPr>
-            <w:tcW w:type="dxa" w:w="4561"/>
+            <w:tcW w:type="dxa" w:w="4703"/>
           </w:tcPr>
           <w:p>
             <w:r>
               <w:rPr>
-                <w:sz w:val="16"/>
+                <w:sz w:val="20"/>
               </w:rPr>
               <w:t>Falsifikasyon</w:t>
             </w:r>
@@ -698,12 +747,12 @@
         </w:tc>
         <w:tc>
           <w:tcPr>
-            <w:tcW w:type="dxa" w:w="4561"/>
+            <w:tcW w:type="dxa" w:w="4703"/>
           </w:tcPr>
           <w:p>
             <w:r>
               <w:rPr>
-                <w:sz w:val="16"/>
+                <w:sz w:val="20"/>
               </w:rPr>
               <w:t>11 hisselik stres testi, Bonferroni p = 0.00012</w:t>
             </w:r>
@@ -713,12 +762,12 @@
       <w:tr>
         <w:tc>
           <w:tcPr>
-            <w:tcW w:type="dxa" w:w="4561"/>
+            <w:tcW w:type="dxa" w:w="4703"/>
           </w:tcPr>
           <w:p>
             <w:r>
               <w:rPr>
-                <w:sz w:val="16"/>
+                <w:sz w:val="20"/>
               </w:rPr>
               <w:t>İstatistiksel anlamlılık</w:t>
             </w:r>
@@ -726,14 +775,14 @@
         </w:tc>
         <w:tc>
           <w:tcPr>
-            <w:tcW w:type="dxa" w:w="4561"/>
+            <w:tcW w:type="dxa" w:w="4703"/>
           </w:tcPr>
           <w:p>
             <w:r>
               <w:rPr>
-                <w:sz w:val="16"/>
+                <w:sz w:val="20"/>
               </w:rPr>
-              <w:t>Bireysel p &lt; 0.0001, Bonferroni p = 0.00012</w:t>
+              <w:t>Bireysel p &lt; 0.0001, Bonferroni-düzeltilmiş p = 0.00012</w:t>
             </w:r>
           </w:p>
         </w:tc>
@@ -741,12 +790,12 @@
       <w:tr>
         <w:tc>
           <w:tcPr>
-            <w:tcW w:type="dxa" w:w="4561"/>
+            <w:tcW w:type="dxa" w:w="4703"/>
           </w:tcPr>
           <w:p>
             <w:r>
               <w:rPr>
-                <w:sz w:val="16"/>
+                <w:sz w:val="20"/>
               </w:rPr>
               <w:t>Ensemble direnci</w:t>
             </w:r>
@@ -754,12 +803,12 @@
         </w:tc>
         <w:tc>
           <w:tcPr>
-            <w:tcW w:type="dxa" w:w="4561"/>
+            <w:tcW w:type="dxa" w:w="4703"/>
           </w:tcPr>
           <w:p>
             <w:r>
               <w:rPr>
-                <w:sz w:val="16"/>
+                <w:sz w:val="20"/>
               </w:rPr>
               <w:t>6-mimari ensemble da anti-prediktif davranışı düzeltmedi</w:t>
             </w:r>
@@ -770,7 +819,7 @@
     <w:p/>
     <w:p>
       <w:pPr>
-        <w:ind w:firstLine="425"/>
+        <w:ind w:firstLine="567"/>
       </w:pPr>
       <w:r>
         <w:t>Sonuç olarak, projemiz derin öğrenme modellerinin finansal tahmin görevlerinde "her zaman daha iyi" olmadığını, aksine belirli makroekonomik koşullar altında sistematik olarak yanlış yöne tahmin yapabildiğini göstermiştir. Bu "anti-prediktif" davranış, literatürde henüz yeterince incelenmemiş kritik bir fenomendir ve projemiz bu boşluğu doldurmaktadır.</w:t>
@@ -778,7 +827,7 @@
     </w:p>
     <w:p>
       <w:pPr>
-        <w:ind w:firstLine="425"/>
+        <w:ind w:firstLine="567"/>
       </w:pPr>
       <w:r>
         <w:t>Projenin gelecek çalışmalarında, 15 iş paketi olarak belirlenen rejim algılama, seçici tahmin (Selective Abstain), çapraz piyasa doğrulama ve duygu analizi entegrasyonu gibi konuların araştırılması hedeflenmektedir.</w:t>
@@ -789,7 +838,7 @@
         <w:pStyle w:val="Heading1"/>
       </w:pPr>
       <w:r>
-        <w:t>4. ÇIKTILAR (Yayınlar, Sunumlar vb.)</w:t>
+        <w:t>Çıktılar (Yayınlar, Sunumlar vb.)</w:t>
       </w:r>
     </w:p>
     <w:p>
@@ -800,7 +849,7 @@
         <w:t xml:space="preserve">GitHub Deposu: </w:t>
       </w:r>
       <w:r>
-        <w:t>https://github.com/kuurtali/Tubitak-2209A-MCAware — 248 dosya, 130 CSV</w:t>
+        <w:t>https://github.com/kuurtali/Tubitak-2209A-MCAware — 248 dosya, 130 CSV çıktı</w:t>
       </w:r>
     </w:p>
     <w:p>
@@ -811,7 +860,7 @@
         <w:t xml:space="preserve">Streamlit Dashboard: </w:t>
       </w:r>
       <w:r>
-        <w:t>mcaware.streamlit.app — 10 tab, TR/EN, gerçek zamanlı interaktif panel</w:t>
+        <w:t>mcaware.streamlit.app — 10 tab, TR/EN, gerçek zamanlı interaktif araştırma paneli</w:t>
       </w:r>
     </w:p>
     <w:p>
@@ -822,7 +871,7 @@
         <w:t xml:space="preserve">Akademik Doküman: </w:t>
       </w:r>
       <w:r>
-        <w:t>Literatur_ve_Limitasyonlar.docx — 25 literatür bölümü + 15 kısıt</w:t>
+        <w:t>Literatur_ve_Limitasyonlar.docx — 25 literatür bölümü + 15 kısıt + 15 gelecek çalışma iş paketi</w:t>
       </w:r>
     </w:p>
     <w:p>
@@ -833,7 +882,7 @@
         <w:t xml:space="preserve">Rapor Görselleri: </w:t>
       </w:r>
       <w:r>
-        <w:t>37 görsel (PNG) + 4 özel rapor görseli</w:t>
+        <w:t>37 görsel (PNG) + 4 özel rapor görseli (sektörel dağılım, fold haritası vb.)</w:t>
       </w:r>
     </w:p>
     <w:p>
@@ -844,7 +893,7 @@
         <w:t xml:space="preserve">Veri Çıktıları: </w:t>
       </w:r>
       <w:r>
-        <w:t>130 CSV: 71 özet + 19 tahmin + 26 diagnostik + 14 eşik grid</w:t>
+        <w:t>130 CSV dosyası: 71 özet + 19 tahmin + 26 diagnostik + 14 eşik grid analizi</w:t>
       </w:r>
     </w:p>
     <w:p>
@@ -855,7 +904,7 @@
         <w:t xml:space="preserve">R Scriptleri: </w:t>
       </w:r>
       <w:r>
-        <w:t>52 R scripti (7 klasör: prototip → araçlar)</w:t>
+        <w:t>52 R scripti, 7 klasör altında organize (01_prototypes → 07_araclar)</w:t>
       </w:r>
     </w:p>
     <w:p>
@@ -863,7 +912,7 @@
         <w:pStyle w:val="Heading1"/>
       </w:pPr>
       <w:r>
-        <w:t>5. HARCAMA KALEMLERİ</w:t>
+        <w:t>Proje ile İlgili Harcama Kalemleri Hakkında Ayrıntılı Bilgi</w:t>
       </w:r>
     </w:p>
     <w:p>
@@ -884,35 +933,45 @@
         <w:tblLook w:firstColumn="1" w:firstRow="1" w:lastColumn="0" w:lastRow="0" w:noHBand="0" w:noVBand="1" w:val="04A0"/>
       </w:tblPr>
       <w:tblGrid>
-        <w:gridCol w:w="4561"/>
-        <w:gridCol w:w="4561"/>
+        <w:gridCol w:w="4703"/>
+        <w:gridCol w:w="4703"/>
       </w:tblGrid>
       <w:tr>
         <w:tc>
           <w:tcPr>
-            <w:tcW w:type="dxa" w:w="4561"/>
+            <w:tcW w:type="dxa" w:w="4703"/>
           </w:tcPr>
           <w:p>
+            <w:pPr>
+              <w:jc w:val="center"/>
+            </w:pPr>
             <w:r>
               <w:rPr>
                 <w:b/>
-                <w:sz w:val="18"/>
+                <w:sz w:val="22"/>
               </w:rPr>
-              <w:t>PROJE YÜRÜTÜCÜSÜ</w:t>
+              <w:t>PROJE YÜRÜTÜCÜSÜNÜN</w:t>
+              <w:br/>
+              <w:t>ADI – SOYADI - İMZA</w:t>
             </w:r>
           </w:p>
         </w:tc>
         <w:tc>
           <w:tcPr>
-            <w:tcW w:type="dxa" w:w="4561"/>
+            <w:tcW w:type="dxa" w:w="4703"/>
           </w:tcPr>
           <w:p>
+            <w:pPr>
+              <w:jc w:val="center"/>
+            </w:pPr>
             <w:r>
               <w:rPr>
                 <w:b/>
-                <w:sz w:val="18"/>
+                <w:sz w:val="22"/>
               </w:rPr>
-              <w:t>DANIŞMAN</w:t>
+              <w:t>DANIŞMANIN</w:t>
+              <w:br/>
+              <w:t>ADI – SOYADI - İMZA</w:t>
             </w:r>
           </w:p>
         </w:tc>
@@ -920,12 +979,15 @@
       <w:tr>
         <w:tc>
           <w:tcPr>
-            <w:tcW w:type="dxa" w:w="4561"/>
+            <w:tcW w:type="dxa" w:w="4703"/>
           </w:tcPr>
           <w:p>
+            <w:pPr>
+              <w:jc w:val="center"/>
+            </w:pPr>
             <w:r>
               <w:rPr>
-                <w:sz w:val="18"/>
+                <w:sz w:val="22"/>
               </w:rPr>
               <w:t>Mehmet Ali Kurt</w:t>
             </w:r>
@@ -933,12 +995,15 @@
         </w:tc>
         <w:tc>
           <w:tcPr>
-            <w:tcW w:type="dxa" w:w="4561"/>
+            <w:tcW w:type="dxa" w:w="4703"/>
           </w:tcPr>
           <w:p>
+            <w:pPr>
+              <w:jc w:val="center"/>
+            </w:pPr>
             <w:r>
               <w:rPr>
-                <w:sz w:val="18"/>
+                <w:sz w:val="22"/>
               </w:rPr>
               <w:t>Öğr. Gör. Elif Ayaz</w:t>
             </w:r>
@@ -948,43 +1013,34 @@
       <w:tr>
         <w:tc>
           <w:tcPr>
-            <w:tcW w:type="dxa" w:w="4561"/>
+            <w:tcW w:type="dxa" w:w="4703"/>
           </w:tcPr>
           <w:p>
-            <w:r>
-              <w:rPr>
-                <w:sz w:val="18"/>
-              </w:rPr>
-              <w:t>İmza:</w:t>
-            </w:r>
+            <w:r/>
           </w:p>
         </w:tc>
         <w:tc>
           <w:tcPr>
-            <w:tcW w:type="dxa" w:w="4561"/>
+            <w:tcW w:type="dxa" w:w="4703"/>
           </w:tcPr>
           <w:p>
-            <w:r>
-              <w:rPr>
-                <w:sz w:val="18"/>
-              </w:rPr>
-              <w:t>İmza:</w:t>
-            </w:r>
+            <w:r/>
           </w:p>
         </w:tc>
       </w:tr>
     </w:tbl>
+    <w:p/>
     <w:p>
       <w:pPr>
         <w:jc w:val="center"/>
       </w:pPr>
       <w:r>
-        <w:t>Tarih: Haziran 2026</w:t>
+        <w:t>Tarih : Haziran 2026</w:t>
       </w:r>
     </w:p>
     <w:sectPr>
       <w:pgSz w:w="12240" w:h="15840"/>
-      <w:pgMar w:top="1417" w:right="1417" w:bottom="1417" w:left="1701" w:header="720" w:footer="720" w:gutter="0"/>
+      <w:pgMar w:top="1417" w:right="1417" w:bottom="1417" w:left="1417" w:header="720" w:footer="720" w:gutter="0"/>
       <w:cols w:space="720"/>
       <w:docGrid w:linePitch="360"/>
     </w:sectPr>
@@ -1356,11 +1412,11 @@
     <w:qFormat/>
     <w:rsid w:val="00FC693F"/>
     <w:pPr>
-      <w:spacing w:line="276" w:lineRule="auto" w:after="80"/>
+      <w:spacing w:line="276" w:lineRule="auto" w:after="120"/>
     </w:pPr>
     <w:rPr>
       <w:rFonts w:ascii="Arial" w:hAnsi="Arial"/>
-      <w:sz w:val="18"/>
+      <w:sz w:val="24"/>
     </w:rPr>
   </w:style>
   <w:style w:type="paragraph" w:styleId="Header">
@@ -1425,7 +1481,7 @@
       <w:rFonts w:asciiTheme="majorHAnsi" w:eastAsiaTheme="majorEastAsia" w:hAnsiTheme="majorHAnsi" w:cstheme="majorBidi" w:ascii="Arial" w:hAnsi="Arial"/>
       <w:b/>
       <w:bCs/>
-      <w:color w:val="1B3A5C"/>
+      <w:color w:val="000000"/>
       <w:sz w:val="28"/>
       <w:szCs w:val="28"/>
     </w:rPr>
@@ -1449,7 +1505,7 @@
       <w:rFonts w:asciiTheme="majorHAnsi" w:eastAsiaTheme="majorEastAsia" w:hAnsiTheme="majorHAnsi" w:cstheme="majorBidi" w:ascii="Arial" w:hAnsi="Arial"/>
       <w:b/>
       <w:bCs/>
-      <w:color w:val="1B3A5C"/>
+      <w:color w:val="000000"/>
       <w:sz w:val="26"/>
       <w:szCs w:val="26"/>
     </w:rPr>
@@ -1473,7 +1529,7 @@
       <w:rFonts w:asciiTheme="majorHAnsi" w:eastAsiaTheme="majorEastAsia" w:hAnsiTheme="majorHAnsi" w:cstheme="majorBidi" w:ascii="Arial" w:hAnsi="Arial"/>
       <w:b/>
       <w:bCs/>
-      <w:color w:val="1B3A5C"/>
+      <w:color w:val="000000"/>
     </w:rPr>
   </w:style>
   <w:style w:type="paragraph" w:styleId="Heading4">

</xml_diff>

<commit_message>
fix: danisman Elif Ayaz -> Dr. Ovgucan Karadag Erdemir (tum dosyalarda) feat: Tab 12 genisletildi - 15 gorsel -> 52 gorsel (8 kategori galeri)
Duzeltilen dosyalar:
- README.md
- app.py (Tab 12: 52 gorsel, 8 kategori, 2 sutun grid)
- Dashboard/index.html
- MC_AWARE_Kisisel_Rapor.docx
- TUBITAK_2209A_Sonuc_Raporu.docx
- generate_kisisel_rapor_v2.py

Tab 12 kategorileri:
1. Proje Ozet & Metodoloji (4)
2. Anti-Prediktif Davranis (5)
3. Sektorel Analiz (6)
4. Ozellik Ablasyonu (7)
5. IN_LEN Ablasyonu (3)
6. Walk-Forward (8)
7. Mimari/Ensemble (8)
8. Sektor Detay & Capraz Piyasa (11)
</commit_message>
<xml_diff>
--- a/Docs/TUBITAK_2209A_Sonuc_Raporu.docx
+++ b/Docs/TUBITAK_2209A_Sonuc_Raporu.docx
@@ -131,7 +131,7 @@
               <w:rPr>
                 <w:sz w:val="22"/>
               </w:rPr>
-              <w:t>Öğr. Gör. Elif Ayaz</w:t>
+              <w:t>Dr. Övgücan Karadağ Erdemir</w:t>
             </w:r>
           </w:p>
         </w:tc>
@@ -1005,7 +1005,7 @@
               <w:rPr>
                 <w:sz w:val="22"/>
               </w:rPr>
-              <w:t>Öğr. Gör. Elif Ayaz</w:t>
+              <w:t>Dr. Övgücan Karadağ Erdemir</w:t>
             </w:r>
           </w:p>
         </w:tc>

</xml_diff>